<commit_message>
Dokumentation der Webseite + Kommentar eingefügt für Java Script
</commit_message>
<xml_diff>
--- a/Meier_Blättler_Maisenbacher_MMA25cL_Gruppe1.docx
+++ b/Meier_Blättler_Maisenbacher_MMA25cL_Gruppe1.docx
@@ -1054,21 +1054,212 @@
         <w:tblStyle w:val="Gitternetztabelle2Akzent6"/>
         <w:tblpPr w:leftFromText="141" w:rightFromText="141" w:vertAnchor="text" w:horzAnchor="margin" w:tblpY="151"/>
         <w:tblW w:w="0" w:type="auto"/>
+        <w:tblLayout w:type="fixed"/>
         <w:tblLook w:val="04A0" w:firstRow="1" w:lastRow="0" w:firstColumn="1" w:lastColumn="0" w:noHBand="0" w:noVBand="1"/>
       </w:tblPr>
       <w:tblGrid>
-        <w:gridCol w:w="6216"/>
-        <w:gridCol w:w="2856"/>
+        <w:gridCol w:w="4395"/>
+        <w:gridCol w:w="4677"/>
       </w:tblGrid>
       <w:tr>
         <w:trPr>
           <w:cnfStyle w:val="100000000000" w:firstRow="1" w:lastRow="0" w:firstColumn="0" w:lastColumn="0" w:oddVBand="0" w:evenVBand="0" w:oddHBand="0" w:evenHBand="0" w:firstRowFirstColumn="0" w:firstRowLastColumn="0" w:lastRowFirstColumn="0" w:lastRowLastColumn="0"/>
+          <w:trHeight w:val="2830"/>
         </w:trPr>
         <w:tc>
           <w:tcPr>
             <w:cnfStyle w:val="001000000000" w:firstRow="0" w:lastRow="0" w:firstColumn="1" w:lastColumn="0" w:oddVBand="0" w:evenVBand="0" w:oddHBand="0" w:evenHBand="0" w:firstRowFirstColumn="0" w:firstRowLastColumn="0" w:lastRowFirstColumn="0" w:lastRowLastColumn="0"/>
-            <w:tcW w:w="6216" w:type="dxa"/>
+            <w:tcW w:w="4395" w:type="dxa"/>
             <w:shd w:val="clear" w:color="auto" w:fill="DDF3CF"/>
+            <w:vAlign w:val="center"/>
+          </w:tcPr>
+          <w:p>
+            <w:r>
+              <w:lastRenderedPageBreak/>
+              <w:drawing>
+                <wp:anchor distT="0" distB="0" distL="114300" distR="114300" simplePos="0" relativeHeight="251673600" behindDoc="0" locked="0" layoutInCell="1" allowOverlap="1" wp14:anchorId="35E77A96" wp14:editId="353B4C1D">
+                  <wp:simplePos x="0" y="0"/>
+                  <wp:positionH relativeFrom="column">
+                    <wp:posOffset>-68580</wp:posOffset>
+                  </wp:positionH>
+                  <wp:positionV relativeFrom="paragraph">
+                    <wp:posOffset>232410</wp:posOffset>
+                  </wp:positionV>
+                  <wp:extent cx="4025265" cy="1153795"/>
+                  <wp:effectExtent l="0" t="0" r="0" b="8255"/>
+                  <wp:wrapTopAndBottom/>
+                  <wp:docPr id="490818066" name="Grafik 1"/>
+                  <wp:cNvGraphicFramePr>
+                    <a:graphicFrameLocks xmlns:a="http://schemas.openxmlformats.org/drawingml/2006/main" noChangeAspect="1"/>
+                  </wp:cNvGraphicFramePr>
+                  <a:graphic xmlns:a="http://schemas.openxmlformats.org/drawingml/2006/main">
+                    <a:graphicData uri="http://schemas.openxmlformats.org/drawingml/2006/picture">
+                      <pic:pic xmlns:pic="http://schemas.openxmlformats.org/drawingml/2006/picture">
+                        <pic:nvPicPr>
+                          <pic:cNvPr id="490818066" name=""/>
+                          <pic:cNvPicPr/>
+                        </pic:nvPicPr>
+                        <pic:blipFill>
+                          <a:blip r:embed="rId6" cstate="print">
+                            <a:extLst>
+                              <a:ext uri="{28A0092B-C50C-407E-A947-70E740481C1C}">
+                                <a14:useLocalDpi xmlns:a14="http://schemas.microsoft.com/office/drawing/2010/main" val="0"/>
+                              </a:ext>
+                            </a:extLst>
+                          </a:blip>
+                          <a:stretch>
+                            <a:fillRect/>
+                          </a:stretch>
+                        </pic:blipFill>
+                        <pic:spPr>
+                          <a:xfrm>
+                            <a:off x="0" y="0"/>
+                            <a:ext cx="4025265" cy="1153795"/>
+                          </a:xfrm>
+                          <a:prstGeom prst="rect">
+                            <a:avLst/>
+                          </a:prstGeom>
+                        </pic:spPr>
+                      </pic:pic>
+                    </a:graphicData>
+                  </a:graphic>
+                  <wp14:sizeRelH relativeFrom="margin">
+                    <wp14:pctWidth>0</wp14:pctWidth>
+                  </wp14:sizeRelH>
+                  <wp14:sizeRelV relativeFrom="margin">
+                    <wp14:pctHeight>0</wp14:pctHeight>
+                  </wp14:sizeRelV>
+                </wp:anchor>
+              </w:drawing>
+            </w:r>
+            <w:r>
+              <w:t>Ordnerstruktur</w:t>
+            </w:r>
+          </w:p>
+        </w:tc>
+        <w:tc>
+          <w:tcPr>
+            <w:tcW w:w="4677" w:type="dxa"/>
+            <w:shd w:val="clear" w:color="auto" w:fill="DDF3CF"/>
+            <w:vAlign w:val="center"/>
+          </w:tcPr>
+          <w:p>
+            <w:pPr>
+              <w:cnfStyle w:val="100000000000" w:firstRow="1" w:lastRow="0" w:firstColumn="0" w:lastColumn="0" w:oddVBand="0" w:evenVBand="0" w:oddHBand="0" w:evenHBand="0" w:firstRowFirstColumn="0" w:firstRowLastColumn="0" w:lastRowFirstColumn="0" w:lastRowLastColumn="0"/>
+              <w:rPr>
+                <w:b w:val="0"/>
+                <w:bCs w:val="0"/>
+              </w:rPr>
+            </w:pPr>
+            <w:r>
+              <w:rPr>
+                <w:b w:val="0"/>
+                <w:bCs w:val="0"/>
+              </w:rPr>
+              <w:t xml:space="preserve">Als </w:t>
+            </w:r>
+            <w:r>
+              <w:rPr>
+                <w:b w:val="0"/>
+                <w:bCs w:val="0"/>
+              </w:rPr>
+              <w:t xml:space="preserve">erstes haben wir </w:t>
+            </w:r>
+            <w:r>
+              <w:rPr>
+                <w:b w:val="0"/>
+                <w:bCs w:val="0"/>
+              </w:rPr>
+              <w:t xml:space="preserve">eine sinnvolle Ordnerstruktur erstellt, wo </w:t>
+            </w:r>
+            <w:proofErr w:type="spellStart"/>
+            <w:r>
+              <w:rPr>
+                <w:b w:val="0"/>
+                <w:bCs w:val="0"/>
+              </w:rPr>
+              <w:t>css</w:t>
+            </w:r>
+            <w:proofErr w:type="spellEnd"/>
+            <w:r>
+              <w:rPr>
+                <w:b w:val="0"/>
+                <w:bCs w:val="0"/>
+              </w:rPr>
+              <w:t xml:space="preserve">, </w:t>
+            </w:r>
+            <w:proofErr w:type="spellStart"/>
+            <w:r>
+              <w:rPr>
+                <w:b w:val="0"/>
+                <w:bCs w:val="0"/>
+              </w:rPr>
+              <w:t>html</w:t>
+            </w:r>
+            <w:proofErr w:type="spellEnd"/>
+            <w:r>
+              <w:rPr>
+                <w:b w:val="0"/>
+                <w:bCs w:val="0"/>
+              </w:rPr>
+              <w:t xml:space="preserve">, </w:t>
+            </w:r>
+            <w:proofErr w:type="spellStart"/>
+            <w:r>
+              <w:rPr>
+                <w:b w:val="0"/>
+                <w:bCs w:val="0"/>
+              </w:rPr>
+              <w:t>bilder</w:t>
+            </w:r>
+            <w:proofErr w:type="spellEnd"/>
+            <w:r>
+              <w:rPr>
+                <w:b w:val="0"/>
+                <w:bCs w:val="0"/>
+              </w:rPr>
+              <w:t xml:space="preserve">, Screenshots </w:t>
+            </w:r>
+            <w:r>
+              <w:t>(</w:t>
+            </w:r>
+            <w:r>
+              <w:rPr>
+                <w:b w:val="0"/>
+                <w:bCs w:val="0"/>
+              </w:rPr>
+              <w:t xml:space="preserve">für Dokumentation) und </w:t>
+            </w:r>
+            <w:proofErr w:type="spellStart"/>
+            <w:r>
+              <w:rPr>
+                <w:b w:val="0"/>
+                <w:bCs w:val="0"/>
+              </w:rPr>
+              <w:t>js</w:t>
+            </w:r>
+            <w:proofErr w:type="spellEnd"/>
+            <w:r>
+              <w:rPr>
+                <w:b w:val="0"/>
+                <w:bCs w:val="0"/>
+              </w:rPr>
+              <w:t xml:space="preserve"> Dateien abgelegt werden.</w:t>
+            </w:r>
+          </w:p>
+        </w:tc>
+      </w:tr>
+      <w:tr>
+        <w:trPr>
+          <w:cnfStyle w:val="000000100000" w:firstRow="0" w:lastRow="0" w:firstColumn="0" w:lastColumn="0" w:oddVBand="0" w:evenVBand="0" w:oddHBand="1" w:evenHBand="0" w:firstRowFirstColumn="0" w:firstRowLastColumn="0" w:lastRowFirstColumn="0" w:lastRowLastColumn="0"/>
+          <w:trHeight w:val="2305"/>
+        </w:trPr>
+        <w:tc>
+          <w:tcPr>
+            <w:cnfStyle w:val="001000000000" w:firstRow="0" w:lastRow="0" w:firstColumn="1" w:lastColumn="0" w:oddVBand="0" w:evenVBand="0" w:oddHBand="0" w:evenHBand="0" w:firstRowFirstColumn="0" w:firstRowLastColumn="0" w:lastRowFirstColumn="0" w:lastRowLastColumn="0"/>
+            <w:tcW w:w="4395" w:type="dxa"/>
+            <w:shd w:val="clear" w:color="auto" w:fill="124F1A" w:themeFill="accent3" w:themeFillShade="BF"/>
+            <w:vAlign w:val="center"/>
           </w:tcPr>
           <w:p>
             <w:pPr>
@@ -1077,6 +1268,197 @@
                 <w:bCs w:val="0"/>
               </w:rPr>
             </w:pPr>
+            <w:r>
+              <w:t xml:space="preserve">Navigation mit Framework </w:t>
+            </w:r>
+          </w:p>
+          <w:p>
+            <w:r>
+              <w:rPr>
+                <w:b w:val="0"/>
+                <w:bCs w:val="0"/>
+              </w:rPr>
+              <w:t>Index</w:t>
+            </w:r>
+            <w:r>
+              <w:rPr>
+                <w:b w:val="0"/>
+                <w:bCs w:val="0"/>
+              </w:rPr>
+              <w:t>.html</w:t>
+            </w:r>
+            <w:r>
+              <w:rPr>
+                <w:b w:val="0"/>
+                <w:bCs w:val="0"/>
+              </w:rPr>
+              <w:t xml:space="preserve"> Zeile 13-51</w:t>
+            </w:r>
+            <w:r>
+              <w:rPr>
+                <w:b w:val="0"/>
+                <w:bCs w:val="0"/>
+              </w:rPr>
+              <w:t xml:space="preserve"> und</w:t>
+            </w:r>
+          </w:p>
+          <w:p>
+            <w:r>
+              <w:rPr>
+                <w:b w:val="0"/>
+                <w:bCs w:val="0"/>
+              </w:rPr>
+              <w:t>Index.css Zeile</w:t>
+            </w:r>
+            <w:r>
+              <w:rPr>
+                <w:b w:val="0"/>
+                <w:bCs w:val="0"/>
+              </w:rPr>
+              <w:t xml:space="preserve"> </w:t>
+            </w:r>
+            <w:r>
+              <w:rPr>
+                <w:b w:val="0"/>
+                <w:bCs w:val="0"/>
+              </w:rPr>
+              <w:t>3</w:t>
+            </w:r>
+            <w:r>
+              <w:rPr>
+                <w:b w:val="0"/>
+                <w:bCs w:val="0"/>
+              </w:rPr>
+              <w:t>8</w:t>
+            </w:r>
+            <w:r>
+              <w:rPr>
+                <w:b w:val="0"/>
+                <w:bCs w:val="0"/>
+              </w:rPr>
+              <w:t>-167</w:t>
+            </w:r>
+            <w:r>
+              <w:rPr>
+                <w:b w:val="0"/>
+                <w:bCs w:val="0"/>
+              </w:rPr>
+              <w:t>:</w:t>
+            </w:r>
+          </w:p>
+        </w:tc>
+        <w:tc>
+          <w:tcPr>
+            <w:tcW w:w="4677" w:type="dxa"/>
+            <w:shd w:val="clear" w:color="auto" w:fill="124F1A" w:themeFill="accent3" w:themeFillShade="BF"/>
+            <w:vAlign w:val="center"/>
+          </w:tcPr>
+          <w:p>
+            <w:pPr>
+              <w:tabs>
+                <w:tab w:val="left" w:pos="3206"/>
+              </w:tabs>
+              <w:cnfStyle w:val="000000100000" w:firstRow="0" w:lastRow="0" w:firstColumn="0" w:lastColumn="0" w:oddVBand="0" w:evenVBand="0" w:oddHBand="1" w:evenHBand="0" w:firstRowFirstColumn="0" w:firstRowLastColumn="0" w:lastRowFirstColumn="0" w:lastRowLastColumn="0"/>
+            </w:pPr>
+            <w:r>
+              <w:t xml:space="preserve">- Google Font </w:t>
+            </w:r>
+            <w:proofErr w:type="spellStart"/>
+            <w:r>
+              <w:t>verlinkung</w:t>
+            </w:r>
+            <w:proofErr w:type="spellEnd"/>
+            <w:r>
+              <w:t xml:space="preserve"> </w:t>
+            </w:r>
+          </w:p>
+          <w:p>
+            <w:pPr>
+              <w:tabs>
+                <w:tab w:val="left" w:pos="3206"/>
+              </w:tabs>
+              <w:cnfStyle w:val="000000100000" w:firstRow="0" w:lastRow="0" w:firstColumn="0" w:lastColumn="0" w:oddVBand="0" w:evenVBand="0" w:oddHBand="1" w:evenHBand="0" w:firstRowFirstColumn="0" w:firstRowLastColumn="0" w:lastRowFirstColumn="0" w:lastRowLastColumn="0"/>
+            </w:pPr>
+            <w:r>
+              <w:t xml:space="preserve">- W3C School </w:t>
+            </w:r>
+            <w:proofErr w:type="spellStart"/>
+            <w:r>
+              <w:t>Navbar</w:t>
+            </w:r>
+            <w:proofErr w:type="spellEnd"/>
+            <w:r>
+              <w:t xml:space="preserve"> (Mobile und Desktop) </w:t>
+            </w:r>
+          </w:p>
+          <w:p>
+            <w:pPr>
+              <w:tabs>
+                <w:tab w:val="left" w:pos="3206"/>
+              </w:tabs>
+              <w:cnfStyle w:val="000000100000" w:firstRow="0" w:lastRow="0" w:firstColumn="0" w:lastColumn="0" w:oddVBand="0" w:evenVBand="0" w:oddHBand="1" w:evenHBand="0" w:firstRowFirstColumn="0" w:firstRowLastColumn="0" w:lastRowFirstColumn="0" w:lastRowLastColumn="0"/>
+            </w:pPr>
+            <w:r>
+              <w:t xml:space="preserve">- </w:t>
+            </w:r>
+            <w:proofErr w:type="spellStart"/>
+            <w:r>
+              <w:t>NavBar</w:t>
+            </w:r>
+            <w:proofErr w:type="spellEnd"/>
+            <w:r>
+              <w:t xml:space="preserve"> Content </w:t>
+            </w:r>
+          </w:p>
+          <w:p>
+            <w:pPr>
+              <w:cnfStyle w:val="000000100000" w:firstRow="0" w:lastRow="0" w:firstColumn="0" w:lastColumn="0" w:oddVBand="0" w:evenVBand="0" w:oddHBand="1" w:evenHBand="0" w:firstRowFirstColumn="0" w:firstRowLastColumn="0" w:lastRowFirstColumn="0" w:lastRowLastColumn="0"/>
+            </w:pPr>
+            <w:r>
+              <w:t xml:space="preserve">- Index Seitentext für </w:t>
+            </w:r>
+            <w:proofErr w:type="spellStart"/>
+            <w:r>
+              <w:t>benotung</w:t>
+            </w:r>
+            <w:proofErr w:type="spellEnd"/>
+          </w:p>
+        </w:tc>
+      </w:tr>
+      <w:tr>
+        <w:trPr>
+          <w:trHeight w:val="1772"/>
+        </w:trPr>
+        <w:tc>
+          <w:tcPr>
+            <w:cnfStyle w:val="001000000000" w:firstRow="0" w:lastRow="0" w:firstColumn="1" w:lastColumn="0" w:oddVBand="0" w:evenVBand="0" w:oddHBand="0" w:evenHBand="0" w:firstRowFirstColumn="0" w:firstRowLastColumn="0" w:lastRowFirstColumn="0" w:lastRowLastColumn="0"/>
+            <w:tcW w:w="4395" w:type="dxa"/>
+            <w:shd w:val="clear" w:color="auto" w:fill="D9F2D0" w:themeFill="accent6" w:themeFillTint="33"/>
+            <w:vAlign w:val="center"/>
+          </w:tcPr>
+          <w:p>
+            <w:r>
+              <w:t>Startseite</w:t>
+            </w:r>
+            <w:r>
+              <w:t xml:space="preserve"> (Text)</w:t>
+            </w:r>
+          </w:p>
+          <w:p>
+            <w:r>
+              <w:rPr>
+                <w:b w:val="0"/>
+                <w:bCs w:val="0"/>
+              </w:rPr>
+              <w:t>Index.html</w:t>
+            </w:r>
+            <w:r>
+              <w:rPr>
+                <w:b w:val="0"/>
+                <w:bCs w:val="0"/>
+              </w:rPr>
+              <w:t xml:space="preserve"> Zeile 53-61</w:t>
+            </w:r>
           </w:p>
           <w:p>
             <w:pPr>
@@ -1085,49 +1467,78 @@
                 <w:bCs w:val="0"/>
               </w:rPr>
             </w:pPr>
-          </w:p>
-          <w:p>
-            <w:pPr>
+            <w:r>
               <w:rPr>
                 <w:b w:val="0"/>
                 <w:bCs w:val="0"/>
               </w:rPr>
-            </w:pPr>
-          </w:p>
-          <w:p>
-            <w:pPr>
+              <w:t>Index.css</w:t>
+            </w:r>
+            <w:r>
               <w:rPr>
                 <w:b w:val="0"/>
                 <w:bCs w:val="0"/>
               </w:rPr>
-            </w:pPr>
-          </w:p>
-          <w:p>
-            <w:pPr>
+              <w:t xml:space="preserve"> Zeile</w:t>
+            </w:r>
+            <w:r>
               <w:rPr>
                 <w:b w:val="0"/>
                 <w:bCs w:val="0"/>
               </w:rPr>
+              <w:t xml:space="preserve"> 1-35</w:t>
+            </w:r>
+          </w:p>
+        </w:tc>
+        <w:tc>
+          <w:tcPr>
+            <w:tcW w:w="4677" w:type="dxa"/>
+            <w:shd w:val="clear" w:color="auto" w:fill="D9F2D0" w:themeFill="accent6" w:themeFillTint="33"/>
+            <w:vAlign w:val="center"/>
+          </w:tcPr>
+          <w:p>
+            <w:pPr>
+              <w:pStyle w:val="Listenabsatz"/>
+              <w:numPr>
+                <w:ilvl w:val="0"/>
+                <w:numId w:val="21"/>
+              </w:numPr>
+              <w:cnfStyle w:val="000000000000" w:firstRow="0" w:lastRow="0" w:firstColumn="0" w:lastColumn="0" w:oddVBand="0" w:evenVBand="0" w:oddHBand="0" w:evenHBand="0" w:firstRowFirstColumn="0" w:firstRowLastColumn="0" w:lastRowFirstColumn="0" w:lastRowLastColumn="0"/>
             </w:pPr>
+            <w:r>
+              <w:t>Namen der Ersteller</w:t>
+            </w:r>
           </w:p>
           <w:p>
             <w:pPr>
-              <w:rPr>
-                <w:b w:val="0"/>
-                <w:bCs w:val="0"/>
-              </w:rPr>
+              <w:pStyle w:val="Listenabsatz"/>
+              <w:numPr>
+                <w:ilvl w:val="0"/>
+                <w:numId w:val="21"/>
+              </w:numPr>
+              <w:cnfStyle w:val="000000000000" w:firstRow="0" w:lastRow="0" w:firstColumn="0" w:lastColumn="0" w:oddVBand="0" w:evenVBand="0" w:oddHBand="0" w:evenHBand="0" w:firstRowFirstColumn="0" w:firstRowLastColumn="0" w:lastRowFirstColumn="0" w:lastRowLastColumn="0"/>
             </w:pPr>
+            <w:r>
+              <w:t xml:space="preserve">Dateiname der dazugehörenden Dokumentation </w:t>
+            </w:r>
           </w:p>
-          <w:p/>
-        </w:tc>
-        <w:tc>
-          <w:tcPr>
-            <w:tcW w:w="2856" w:type="dxa"/>
-            <w:shd w:val="clear" w:color="auto" w:fill="DDF3CF"/>
-          </w:tcPr>
           <w:p>
             <w:pPr>
-              <w:cnfStyle w:val="100000000000" w:firstRow="1" w:lastRow="0" w:firstColumn="0" w:lastColumn="0" w:oddVBand="0" w:evenVBand="0" w:oddHBand="0" w:evenHBand="0" w:firstRowFirstColumn="0" w:firstRowLastColumn="0" w:lastRowFirstColumn="0" w:lastRowLastColumn="0"/>
+              <w:pStyle w:val="Listenabsatz"/>
+              <w:numPr>
+                <w:ilvl w:val="0"/>
+                <w:numId w:val="21"/>
+              </w:numPr>
+              <w:cnfStyle w:val="000000000000" w:firstRow="0" w:lastRow="0" w:firstColumn="0" w:lastColumn="0" w:oddVBand="0" w:evenVBand="0" w:oddHBand="0" w:evenHBand="0" w:firstRowFirstColumn="0" w:firstRowLastColumn="0" w:lastRowFirstColumn="0" w:lastRowLastColumn="0"/>
+            </w:pPr>
+            <w:r>
+              <w:t>Abgabedatum</w:t>
+            </w:r>
+          </w:p>
+          <w:p>
+            <w:pPr>
+              <w:pStyle w:val="Listenabsatz"/>
+              <w:cnfStyle w:val="000000000000" w:firstRow="0" w:lastRow="0" w:firstColumn="0" w:lastColumn="0" w:oddVBand="0" w:evenVBand="0" w:oddHBand="0" w:evenHBand="0" w:firstRowFirstColumn="0" w:firstRowLastColumn="0" w:lastRowFirstColumn="0" w:lastRowLastColumn="0"/>
             </w:pPr>
           </w:p>
         </w:tc>
@@ -1139,353 +1550,9 @@
         <w:tc>
           <w:tcPr>
             <w:cnfStyle w:val="001000000000" w:firstRow="0" w:lastRow="0" w:firstColumn="1" w:lastColumn="0" w:oddVBand="0" w:evenVBand="0" w:oddHBand="0" w:evenHBand="0" w:firstRowFirstColumn="0" w:firstRowLastColumn="0" w:lastRowFirstColumn="0" w:lastRowLastColumn="0"/>
-            <w:tcW w:w="6216" w:type="dxa"/>
+            <w:tcW w:w="4395" w:type="dxa"/>
             <w:shd w:val="clear" w:color="auto" w:fill="124F1A" w:themeFill="accent3" w:themeFillShade="BF"/>
-          </w:tcPr>
-          <w:p>
-            <w:pPr>
-              <w:rPr>
-                <w:b w:val="0"/>
-                <w:bCs w:val="0"/>
-              </w:rPr>
-            </w:pPr>
-          </w:p>
-          <w:p>
-            <w:pPr>
-              <w:rPr>
-                <w:b w:val="0"/>
-                <w:bCs w:val="0"/>
-              </w:rPr>
-            </w:pPr>
-          </w:p>
-          <w:p>
-            <w:pPr>
-              <w:rPr>
-                <w:b w:val="0"/>
-                <w:bCs w:val="0"/>
-              </w:rPr>
-            </w:pPr>
-          </w:p>
-          <w:p>
-            <w:pPr>
-              <w:rPr>
-                <w:b w:val="0"/>
-                <w:bCs w:val="0"/>
-              </w:rPr>
-            </w:pPr>
-          </w:p>
-          <w:p>
-            <w:pPr>
-              <w:rPr>
-                <w:b w:val="0"/>
-                <w:bCs w:val="0"/>
-              </w:rPr>
-            </w:pPr>
-          </w:p>
-          <w:p>
-            <w:pPr>
-              <w:rPr>
-                <w:b w:val="0"/>
-                <w:bCs w:val="0"/>
-              </w:rPr>
-            </w:pPr>
-          </w:p>
-          <w:p>
-            <w:pPr>
-              <w:rPr>
-                <w:b w:val="0"/>
-                <w:bCs w:val="0"/>
-              </w:rPr>
-            </w:pPr>
-          </w:p>
-          <w:p>
-            <w:pPr>
-              <w:rPr>
-                <w:b w:val="0"/>
-                <w:bCs w:val="0"/>
-              </w:rPr>
-            </w:pPr>
-          </w:p>
-          <w:p/>
-        </w:tc>
-        <w:tc>
-          <w:tcPr>
-            <w:tcW w:w="2856" w:type="dxa"/>
-            <w:shd w:val="clear" w:color="auto" w:fill="124F1A" w:themeFill="accent3" w:themeFillShade="BF"/>
-          </w:tcPr>
-          <w:p>
-            <w:pPr>
-              <w:tabs>
-                <w:tab w:val="left" w:pos="3206"/>
-              </w:tabs>
-              <w:cnfStyle w:val="000000100000" w:firstRow="0" w:lastRow="0" w:firstColumn="0" w:lastColumn="0" w:oddVBand="0" w:evenVBand="0" w:oddHBand="1" w:evenHBand="0" w:firstRowFirstColumn="0" w:firstRowLastColumn="0" w:lastRowFirstColumn="0" w:lastRowLastColumn="0"/>
-              <w:rPr>
-                <w:sz w:val="20"/>
-                <w:szCs w:val="20"/>
-              </w:rPr>
-            </w:pPr>
-          </w:p>
-          <w:p>
-            <w:pPr>
-              <w:tabs>
-                <w:tab w:val="left" w:pos="3206"/>
-              </w:tabs>
-              <w:cnfStyle w:val="000000100000" w:firstRow="0" w:lastRow="0" w:firstColumn="0" w:lastColumn="0" w:oddVBand="0" w:evenVBand="0" w:oddHBand="1" w:evenHBand="0" w:firstRowFirstColumn="0" w:firstRowLastColumn="0" w:lastRowFirstColumn="0" w:lastRowLastColumn="0"/>
-              <w:rPr>
-                <w:sz w:val="20"/>
-                <w:szCs w:val="20"/>
-              </w:rPr>
-            </w:pPr>
-            <w:r>
-              <w:rPr>
-                <w:sz w:val="20"/>
-                <w:szCs w:val="20"/>
-              </w:rPr>
-              <w:t xml:space="preserve">- Google Font </w:t>
-            </w:r>
-            <w:proofErr w:type="spellStart"/>
-            <w:r>
-              <w:rPr>
-                <w:sz w:val="20"/>
-                <w:szCs w:val="20"/>
-              </w:rPr>
-              <w:t>verlinkung</w:t>
-            </w:r>
-            <w:proofErr w:type="spellEnd"/>
-            <w:r>
-              <w:rPr>
-                <w:sz w:val="20"/>
-                <w:szCs w:val="20"/>
-              </w:rPr>
-              <w:t xml:space="preserve"> </w:t>
-            </w:r>
-          </w:p>
-          <w:p>
-            <w:pPr>
-              <w:tabs>
-                <w:tab w:val="left" w:pos="3206"/>
-              </w:tabs>
-              <w:cnfStyle w:val="000000100000" w:firstRow="0" w:lastRow="0" w:firstColumn="0" w:lastColumn="0" w:oddVBand="0" w:evenVBand="0" w:oddHBand="1" w:evenHBand="0" w:firstRowFirstColumn="0" w:firstRowLastColumn="0" w:lastRowFirstColumn="0" w:lastRowLastColumn="0"/>
-              <w:rPr>
-                <w:sz w:val="20"/>
-                <w:szCs w:val="20"/>
-              </w:rPr>
-            </w:pPr>
-            <w:r>
-              <w:rPr>
-                <w:sz w:val="20"/>
-                <w:szCs w:val="20"/>
-              </w:rPr>
-              <w:t xml:space="preserve">- W3C School </w:t>
-            </w:r>
-            <w:proofErr w:type="spellStart"/>
-            <w:r>
-              <w:rPr>
-                <w:sz w:val="20"/>
-                <w:szCs w:val="20"/>
-              </w:rPr>
-              <w:t>Navbar</w:t>
-            </w:r>
-            <w:proofErr w:type="spellEnd"/>
-            <w:r>
-              <w:rPr>
-                <w:sz w:val="20"/>
-                <w:szCs w:val="20"/>
-              </w:rPr>
-              <w:t xml:space="preserve"> (Mobile und Desktop) </w:t>
-            </w:r>
-          </w:p>
-          <w:p>
-            <w:pPr>
-              <w:tabs>
-                <w:tab w:val="left" w:pos="3206"/>
-              </w:tabs>
-              <w:cnfStyle w:val="000000100000" w:firstRow="0" w:lastRow="0" w:firstColumn="0" w:lastColumn="0" w:oddVBand="0" w:evenVBand="0" w:oddHBand="1" w:evenHBand="0" w:firstRowFirstColumn="0" w:firstRowLastColumn="0" w:lastRowFirstColumn="0" w:lastRowLastColumn="0"/>
-              <w:rPr>
-                <w:sz w:val="20"/>
-                <w:szCs w:val="20"/>
-              </w:rPr>
-            </w:pPr>
-            <w:r>
-              <w:rPr>
-                <w:sz w:val="20"/>
-                <w:szCs w:val="20"/>
-              </w:rPr>
-              <w:t xml:space="preserve">- </w:t>
-            </w:r>
-            <w:proofErr w:type="spellStart"/>
-            <w:r>
-              <w:rPr>
-                <w:sz w:val="20"/>
-                <w:szCs w:val="20"/>
-              </w:rPr>
-              <w:t>NavBar</w:t>
-            </w:r>
-            <w:proofErr w:type="spellEnd"/>
-            <w:r>
-              <w:rPr>
-                <w:sz w:val="20"/>
-                <w:szCs w:val="20"/>
-              </w:rPr>
-              <w:t xml:space="preserve"> Content </w:t>
-            </w:r>
-          </w:p>
-          <w:p>
-            <w:pPr>
-              <w:cnfStyle w:val="000000100000" w:firstRow="0" w:lastRow="0" w:firstColumn="0" w:lastColumn="0" w:oddVBand="0" w:evenVBand="0" w:oddHBand="1" w:evenHBand="0" w:firstRowFirstColumn="0" w:firstRowLastColumn="0" w:lastRowFirstColumn="0" w:lastRowLastColumn="0"/>
-            </w:pPr>
-            <w:r>
-              <w:rPr>
-                <w:sz w:val="20"/>
-                <w:szCs w:val="20"/>
-              </w:rPr>
-              <w:t xml:space="preserve">- Index Seitentext für </w:t>
-            </w:r>
-            <w:proofErr w:type="spellStart"/>
-            <w:r>
-              <w:rPr>
-                <w:sz w:val="20"/>
-                <w:szCs w:val="20"/>
-              </w:rPr>
-              <w:t>benotung</w:t>
-            </w:r>
-            <w:proofErr w:type="spellEnd"/>
-          </w:p>
-        </w:tc>
-      </w:tr>
-      <w:tr>
-        <w:tc>
-          <w:tcPr>
-            <w:cnfStyle w:val="001000000000" w:firstRow="0" w:lastRow="0" w:firstColumn="1" w:lastColumn="0" w:oddVBand="0" w:evenVBand="0" w:oddHBand="0" w:evenHBand="0" w:firstRowFirstColumn="0" w:firstRowLastColumn="0" w:lastRowFirstColumn="0" w:lastRowLastColumn="0"/>
-            <w:tcW w:w="6216" w:type="dxa"/>
-            <w:shd w:val="clear" w:color="auto" w:fill="D9F2D0" w:themeFill="accent6" w:themeFillTint="33"/>
-          </w:tcPr>
-          <w:p/>
-        </w:tc>
-        <w:tc>
-          <w:tcPr>
-            <w:tcW w:w="2856" w:type="dxa"/>
-            <w:shd w:val="clear" w:color="auto" w:fill="D9F2D0" w:themeFill="accent6" w:themeFillTint="33"/>
-          </w:tcPr>
-          <w:p>
-            <w:pPr>
-              <w:cnfStyle w:val="000000000000" w:firstRow="0" w:lastRow="0" w:firstColumn="0" w:lastColumn="0" w:oddVBand="0" w:evenVBand="0" w:oddHBand="0" w:evenHBand="0" w:firstRowFirstColumn="0" w:firstRowLastColumn="0" w:lastRowFirstColumn="0" w:lastRowLastColumn="0"/>
-            </w:pPr>
-            <w:r>
-              <w:rPr>
-                <w:sz w:val="20"/>
-                <w:szCs w:val="20"/>
-              </w:rPr>
-              <w:t>Änderungen bei allen .</w:t>
-            </w:r>
-            <w:proofErr w:type="spellStart"/>
-            <w:r>
-              <w:rPr>
-                <w:sz w:val="20"/>
-                <w:szCs w:val="20"/>
-              </w:rPr>
-              <w:t>html</w:t>
-            </w:r>
-            <w:proofErr w:type="spellEnd"/>
-            <w:r>
-              <w:rPr>
-                <w:sz w:val="20"/>
-                <w:szCs w:val="20"/>
-              </w:rPr>
-              <w:t xml:space="preserve"> </w:t>
-            </w:r>
-            <w:proofErr w:type="spellStart"/>
-            <w:r>
-              <w:rPr>
-                <w:sz w:val="20"/>
-                <w:szCs w:val="20"/>
-              </w:rPr>
-              <w:t>files</w:t>
-            </w:r>
-            <w:proofErr w:type="spellEnd"/>
-            <w:r>
-              <w:rPr>
-                <w:sz w:val="20"/>
-                <w:szCs w:val="20"/>
-              </w:rPr>
-              <w:t xml:space="preserve"> wie auch .</w:t>
-            </w:r>
-            <w:proofErr w:type="gramStart"/>
-            <w:r>
-              <w:rPr>
-                <w:sz w:val="20"/>
-                <w:szCs w:val="20"/>
-              </w:rPr>
-              <w:t>CSS Files</w:t>
-            </w:r>
-            <w:proofErr w:type="gramEnd"/>
-            <w:r>
-              <w:rPr>
-                <w:sz w:val="20"/>
-                <w:szCs w:val="20"/>
-              </w:rPr>
-              <w:t xml:space="preserve">. Hinzugefügte Spalten mit W3. Dazu gehören alle </w:t>
-            </w:r>
-            <w:proofErr w:type="gramStart"/>
-            <w:r>
-              <w:rPr>
-                <w:sz w:val="20"/>
-                <w:szCs w:val="20"/>
-              </w:rPr>
-              <w:t>Aufgaben</w:t>
-            </w:r>
-            <w:proofErr w:type="gramEnd"/>
-            <w:r>
-              <w:rPr>
-                <w:sz w:val="20"/>
-                <w:szCs w:val="20"/>
-              </w:rPr>
-              <w:t xml:space="preserve"> die sich um Spalten gehen (2,3,4) Einigkeit mit der Navigation (ausser index.html). Hinzugefügte Änderungen zum </w:t>
-            </w:r>
-            <w:proofErr w:type="spellStart"/>
-            <w:r>
-              <w:rPr>
-                <w:sz w:val="20"/>
-                <w:szCs w:val="20"/>
-              </w:rPr>
-              <w:t>aussehen</w:t>
-            </w:r>
-            <w:proofErr w:type="spellEnd"/>
-            <w:r>
-              <w:rPr>
-                <w:sz w:val="20"/>
-                <w:szCs w:val="20"/>
-              </w:rPr>
-              <w:t xml:space="preserve"> bei 2,</w:t>
-            </w:r>
-            <w:proofErr w:type="gramStart"/>
-            <w:r>
-              <w:rPr>
-                <w:sz w:val="20"/>
-                <w:szCs w:val="20"/>
-              </w:rPr>
-              <w:t>3,4.html</w:t>
-            </w:r>
-            <w:proofErr w:type="gramEnd"/>
-            <w:r>
-              <w:rPr>
-                <w:sz w:val="20"/>
-                <w:szCs w:val="20"/>
-              </w:rPr>
-              <w:t>.</w:t>
-            </w:r>
-          </w:p>
-        </w:tc>
-      </w:tr>
-      <w:tr>
-        <w:trPr>
-          <w:cnfStyle w:val="000000100000" w:firstRow="0" w:lastRow="0" w:firstColumn="0" w:lastColumn="0" w:oddVBand="0" w:evenVBand="0" w:oddHBand="1" w:evenHBand="0" w:firstRowFirstColumn="0" w:firstRowLastColumn="0" w:lastRowFirstColumn="0" w:lastRowLastColumn="0"/>
-        </w:trPr>
-        <w:tc>
-          <w:tcPr>
-            <w:cnfStyle w:val="001000000000" w:firstRow="0" w:lastRow="0" w:firstColumn="1" w:lastColumn="0" w:oddVBand="0" w:evenVBand="0" w:oddHBand="0" w:evenHBand="0" w:firstRowFirstColumn="0" w:firstRowLastColumn="0" w:lastRowFirstColumn="0" w:lastRowLastColumn="0"/>
-            <w:tcW w:w="6216" w:type="dxa"/>
-            <w:shd w:val="clear" w:color="auto" w:fill="124F1A" w:themeFill="accent3" w:themeFillShade="BF"/>
+            <w:vAlign w:val="center"/>
           </w:tcPr>
           <w:p/>
           <w:p/>
@@ -1496,8 +1563,9 @@
         </w:tc>
         <w:tc>
           <w:tcPr>
-            <w:tcW w:w="2856" w:type="dxa"/>
+            <w:tcW w:w="4677" w:type="dxa"/>
             <w:shd w:val="clear" w:color="auto" w:fill="124F1A" w:themeFill="accent3" w:themeFillShade="BF"/>
+            <w:vAlign w:val="center"/>
           </w:tcPr>
           <w:p>
             <w:pPr>
@@ -1510,8 +1578,9 @@
         <w:tc>
           <w:tcPr>
             <w:cnfStyle w:val="001000000000" w:firstRow="0" w:lastRow="0" w:firstColumn="1" w:lastColumn="0" w:oddVBand="0" w:evenVBand="0" w:oddHBand="0" w:evenHBand="0" w:firstRowFirstColumn="0" w:firstRowLastColumn="0" w:lastRowFirstColumn="0" w:lastRowLastColumn="0"/>
-            <w:tcW w:w="6216" w:type="dxa"/>
+            <w:tcW w:w="4395" w:type="dxa"/>
             <w:shd w:val="clear" w:color="auto" w:fill="D9F2D0" w:themeFill="accent6" w:themeFillTint="33"/>
+            <w:vAlign w:val="center"/>
           </w:tcPr>
           <w:p/>
           <w:p/>
@@ -1522,8 +1591,9 @@
         </w:tc>
         <w:tc>
           <w:tcPr>
-            <w:tcW w:w="2856" w:type="dxa"/>
+            <w:tcW w:w="4677" w:type="dxa"/>
             <w:shd w:val="clear" w:color="auto" w:fill="D9F2D0" w:themeFill="accent6" w:themeFillTint="33"/>
+            <w:vAlign w:val="center"/>
           </w:tcPr>
           <w:p>
             <w:pPr>
@@ -1539,8 +1609,9 @@
         <w:tc>
           <w:tcPr>
             <w:cnfStyle w:val="001000000000" w:firstRow="0" w:lastRow="0" w:firstColumn="1" w:lastColumn="0" w:oddVBand="0" w:evenVBand="0" w:oddHBand="0" w:evenHBand="0" w:firstRowFirstColumn="0" w:firstRowLastColumn="0" w:lastRowFirstColumn="0" w:lastRowLastColumn="0"/>
-            <w:tcW w:w="6216" w:type="dxa"/>
+            <w:tcW w:w="4395" w:type="dxa"/>
             <w:shd w:val="clear" w:color="auto" w:fill="124F1A" w:themeFill="accent3" w:themeFillShade="BF"/>
+            <w:vAlign w:val="center"/>
           </w:tcPr>
           <w:p/>
           <w:p/>
@@ -1551,8 +1622,9 @@
         </w:tc>
         <w:tc>
           <w:tcPr>
-            <w:tcW w:w="2856" w:type="dxa"/>
+            <w:tcW w:w="4677" w:type="dxa"/>
             <w:shd w:val="clear" w:color="auto" w:fill="124F1A" w:themeFill="accent3" w:themeFillShade="BF"/>
+            <w:vAlign w:val="center"/>
           </w:tcPr>
           <w:p>
             <w:pPr>
@@ -3050,6 +3122,118 @@
     </w:lvl>
   </w:abstractNum>
   <w:abstractNum w:abstractNumId="9" w15:restartNumberingAfterBreak="0">
+    <w:nsid w:val="2E8A317F"/>
+    <w:multiLevelType w:val="hybridMultilevel"/>
+    <w:tmpl w:val="2B748FF2"/>
+    <w:lvl w:ilvl="0" w:tplc="F62EFB08">
+      <w:numFmt w:val="bullet"/>
+      <w:lvlText w:val="-"/>
+      <w:lvlJc w:val="left"/>
+      <w:pPr>
+        <w:ind w:left="720" w:hanging="360"/>
+      </w:pPr>
+      <w:rPr>
+        <w:rFonts w:ascii="Aptos" w:eastAsiaTheme="minorHAnsi" w:hAnsi="Aptos" w:cstheme="minorBidi" w:hint="default"/>
+      </w:rPr>
+    </w:lvl>
+    <w:lvl w:ilvl="1" w:tplc="08070003" w:tentative="1">
+      <w:start w:val="1"/>
+      <w:numFmt w:val="bullet"/>
+      <w:lvlText w:val="o"/>
+      <w:lvlJc w:val="left"/>
+      <w:pPr>
+        <w:ind w:left="1440" w:hanging="360"/>
+      </w:pPr>
+      <w:rPr>
+        <w:rFonts w:ascii="Courier New" w:hAnsi="Courier New" w:cs="Courier New" w:hint="default"/>
+      </w:rPr>
+    </w:lvl>
+    <w:lvl w:ilvl="2" w:tplc="08070005" w:tentative="1">
+      <w:start w:val="1"/>
+      <w:numFmt w:val="bullet"/>
+      <w:lvlText w:val=""/>
+      <w:lvlJc w:val="left"/>
+      <w:pPr>
+        <w:ind w:left="2160" w:hanging="360"/>
+      </w:pPr>
+      <w:rPr>
+        <w:rFonts w:ascii="Wingdings" w:hAnsi="Wingdings" w:hint="default"/>
+      </w:rPr>
+    </w:lvl>
+    <w:lvl w:ilvl="3" w:tplc="08070001" w:tentative="1">
+      <w:start w:val="1"/>
+      <w:numFmt w:val="bullet"/>
+      <w:lvlText w:val=""/>
+      <w:lvlJc w:val="left"/>
+      <w:pPr>
+        <w:ind w:left="2880" w:hanging="360"/>
+      </w:pPr>
+      <w:rPr>
+        <w:rFonts w:ascii="Symbol" w:hAnsi="Symbol" w:hint="default"/>
+      </w:rPr>
+    </w:lvl>
+    <w:lvl w:ilvl="4" w:tplc="08070003" w:tentative="1">
+      <w:start w:val="1"/>
+      <w:numFmt w:val="bullet"/>
+      <w:lvlText w:val="o"/>
+      <w:lvlJc w:val="left"/>
+      <w:pPr>
+        <w:ind w:left="3600" w:hanging="360"/>
+      </w:pPr>
+      <w:rPr>
+        <w:rFonts w:ascii="Courier New" w:hAnsi="Courier New" w:cs="Courier New" w:hint="default"/>
+      </w:rPr>
+    </w:lvl>
+    <w:lvl w:ilvl="5" w:tplc="08070005" w:tentative="1">
+      <w:start w:val="1"/>
+      <w:numFmt w:val="bullet"/>
+      <w:lvlText w:val=""/>
+      <w:lvlJc w:val="left"/>
+      <w:pPr>
+        <w:ind w:left="4320" w:hanging="360"/>
+      </w:pPr>
+      <w:rPr>
+        <w:rFonts w:ascii="Wingdings" w:hAnsi="Wingdings" w:hint="default"/>
+      </w:rPr>
+    </w:lvl>
+    <w:lvl w:ilvl="6" w:tplc="08070001" w:tentative="1">
+      <w:start w:val="1"/>
+      <w:numFmt w:val="bullet"/>
+      <w:lvlText w:val=""/>
+      <w:lvlJc w:val="left"/>
+      <w:pPr>
+        <w:ind w:left="5040" w:hanging="360"/>
+      </w:pPr>
+      <w:rPr>
+        <w:rFonts w:ascii="Symbol" w:hAnsi="Symbol" w:hint="default"/>
+      </w:rPr>
+    </w:lvl>
+    <w:lvl w:ilvl="7" w:tplc="08070003" w:tentative="1">
+      <w:start w:val="1"/>
+      <w:numFmt w:val="bullet"/>
+      <w:lvlText w:val="o"/>
+      <w:lvlJc w:val="left"/>
+      <w:pPr>
+        <w:ind w:left="5760" w:hanging="360"/>
+      </w:pPr>
+      <w:rPr>
+        <w:rFonts w:ascii="Courier New" w:hAnsi="Courier New" w:cs="Courier New" w:hint="default"/>
+      </w:rPr>
+    </w:lvl>
+    <w:lvl w:ilvl="8" w:tplc="08070005" w:tentative="1">
+      <w:start w:val="1"/>
+      <w:numFmt w:val="bullet"/>
+      <w:lvlText w:val=""/>
+      <w:lvlJc w:val="left"/>
+      <w:pPr>
+        <w:ind w:left="6480" w:hanging="360"/>
+      </w:pPr>
+      <w:rPr>
+        <w:rFonts w:ascii="Wingdings" w:hAnsi="Wingdings" w:hint="default"/>
+      </w:rPr>
+    </w:lvl>
+  </w:abstractNum>
+  <w:abstractNum w:abstractNumId="10" w15:restartNumberingAfterBreak="0">
     <w:nsid w:val="2EA24069"/>
     <w:multiLevelType w:val="hybridMultilevel"/>
     <w:tmpl w:val="D1CE7C58"/>
@@ -3162,7 +3346,7 @@
       </w:rPr>
     </w:lvl>
   </w:abstractNum>
-  <w:abstractNum w:abstractNumId="10" w15:restartNumberingAfterBreak="0">
+  <w:abstractNum w:abstractNumId="11" w15:restartNumberingAfterBreak="0">
     <w:nsid w:val="31071485"/>
     <w:multiLevelType w:val="hybridMultilevel"/>
     <w:tmpl w:val="5CCA4794"/>
@@ -3275,7 +3459,7 @@
       </w:rPr>
     </w:lvl>
   </w:abstractNum>
-  <w:abstractNum w:abstractNumId="11" w15:restartNumberingAfterBreak="0">
+  <w:abstractNum w:abstractNumId="12" w15:restartNumberingAfterBreak="0">
     <w:nsid w:val="391E6CBB"/>
     <w:multiLevelType w:val="hybridMultilevel"/>
     <w:tmpl w:val="02C82ADA"/>
@@ -3388,7 +3572,7 @@
       </w:rPr>
     </w:lvl>
   </w:abstractNum>
-  <w:abstractNum w:abstractNumId="12" w15:restartNumberingAfterBreak="0">
+  <w:abstractNum w:abstractNumId="13" w15:restartNumberingAfterBreak="0">
     <w:nsid w:val="3B6D7E70"/>
     <w:multiLevelType w:val="hybridMultilevel"/>
     <w:tmpl w:val="0D14FC78"/>
@@ -3501,7 +3685,7 @@
       </w:rPr>
     </w:lvl>
   </w:abstractNum>
-  <w:abstractNum w:abstractNumId="13" w15:restartNumberingAfterBreak="0">
+  <w:abstractNum w:abstractNumId="14" w15:restartNumberingAfterBreak="0">
     <w:nsid w:val="3EEF1597"/>
     <w:multiLevelType w:val="hybridMultilevel"/>
     <w:tmpl w:val="CB505132"/>
@@ -3614,7 +3798,7 @@
       </w:rPr>
     </w:lvl>
   </w:abstractNum>
-  <w:abstractNum w:abstractNumId="14" w15:restartNumberingAfterBreak="0">
+  <w:abstractNum w:abstractNumId="15" w15:restartNumberingAfterBreak="0">
     <w:nsid w:val="431F36E3"/>
     <w:multiLevelType w:val="multilevel"/>
     <w:tmpl w:val="B5AE6FD4"/>
@@ -3763,7 +3947,7 @@
       </w:rPr>
     </w:lvl>
   </w:abstractNum>
-  <w:abstractNum w:abstractNumId="15" w15:restartNumberingAfterBreak="0">
+  <w:abstractNum w:abstractNumId="16" w15:restartNumberingAfterBreak="0">
     <w:nsid w:val="511E22CF"/>
     <w:multiLevelType w:val="multilevel"/>
     <w:tmpl w:val="22768E02"/>
@@ -3912,7 +4096,7 @@
       </w:rPr>
     </w:lvl>
   </w:abstractNum>
-  <w:abstractNum w:abstractNumId="16" w15:restartNumberingAfterBreak="0">
+  <w:abstractNum w:abstractNumId="17" w15:restartNumberingAfterBreak="0">
     <w:nsid w:val="54091C02"/>
     <w:multiLevelType w:val="hybridMultilevel"/>
     <w:tmpl w:val="31004FF6"/>
@@ -4024,7 +4208,7 @@
       </w:rPr>
     </w:lvl>
   </w:abstractNum>
-  <w:abstractNum w:abstractNumId="17" w15:restartNumberingAfterBreak="0">
+  <w:abstractNum w:abstractNumId="18" w15:restartNumberingAfterBreak="0">
     <w:nsid w:val="64560368"/>
     <w:multiLevelType w:val="hybridMultilevel"/>
     <w:tmpl w:val="BFE2C126"/>
@@ -4137,7 +4321,7 @@
       </w:rPr>
     </w:lvl>
   </w:abstractNum>
-  <w:abstractNum w:abstractNumId="18" w15:restartNumberingAfterBreak="0">
+  <w:abstractNum w:abstractNumId="19" w15:restartNumberingAfterBreak="0">
     <w:nsid w:val="6A191E8D"/>
     <w:multiLevelType w:val="hybridMultilevel"/>
     <w:tmpl w:val="A1886E78"/>
@@ -4250,7 +4434,7 @@
       </w:rPr>
     </w:lvl>
   </w:abstractNum>
-  <w:abstractNum w:abstractNumId="19" w15:restartNumberingAfterBreak="0">
+  <w:abstractNum w:abstractNumId="20" w15:restartNumberingAfterBreak="0">
     <w:nsid w:val="6F48755B"/>
     <w:multiLevelType w:val="multilevel"/>
     <w:tmpl w:val="DC6A525A"/>
@@ -4400,10 +4584,10 @@
     </w:lvl>
   </w:abstractNum>
   <w:num w:numId="1" w16cid:durableId="1022586412">
-    <w:abstractNumId w:val="16"/>
+    <w:abstractNumId w:val="17"/>
   </w:num>
   <w:num w:numId="2" w16cid:durableId="645472241">
-    <w:abstractNumId w:val="15"/>
+    <w:abstractNumId w:val="16"/>
   </w:num>
   <w:num w:numId="3" w16cid:durableId="55009958">
     <w:abstractNumId w:val="2"/>
@@ -4418,10 +4602,10 @@
     <w:abstractNumId w:val="1"/>
   </w:num>
   <w:num w:numId="7" w16cid:durableId="1428500697">
-    <w:abstractNumId w:val="10"/>
+    <w:abstractNumId w:val="11"/>
   </w:num>
   <w:num w:numId="8" w16cid:durableId="1222135522">
-    <w:abstractNumId w:val="9"/>
+    <w:abstractNumId w:val="10"/>
   </w:num>
   <w:num w:numId="9" w16cid:durableId="2062245617">
     <w:abstractNumId w:val="5"/>
@@ -4433,13 +4617,13 @@
     <w:abstractNumId w:val="0"/>
   </w:num>
   <w:num w:numId="12" w16cid:durableId="1359353993">
-    <w:abstractNumId w:val="17"/>
+    <w:abstractNumId w:val="18"/>
   </w:num>
   <w:num w:numId="13" w16cid:durableId="2103868526">
-    <w:abstractNumId w:val="18"/>
+    <w:abstractNumId w:val="19"/>
   </w:num>
   <w:num w:numId="14" w16cid:durableId="110974459">
-    <w:abstractNumId w:val="11"/>
+    <w:abstractNumId w:val="12"/>
   </w:num>
   <w:num w:numId="15" w16cid:durableId="1049762961">
     <w:abstractNumId w:val="3"/>
@@ -4448,16 +4632,19 @@
     <w:abstractNumId w:val="4"/>
   </w:num>
   <w:num w:numId="17" w16cid:durableId="1455783164">
-    <w:abstractNumId w:val="12"/>
+    <w:abstractNumId w:val="13"/>
   </w:num>
   <w:num w:numId="18" w16cid:durableId="1876190051">
-    <w:abstractNumId w:val="19"/>
+    <w:abstractNumId w:val="20"/>
   </w:num>
   <w:num w:numId="19" w16cid:durableId="1400055150">
+    <w:abstractNumId w:val="15"/>
+  </w:num>
+  <w:num w:numId="20" w16cid:durableId="640155789">
     <w:abstractNumId w:val="14"/>
   </w:num>
-  <w:num w:numId="20" w16cid:durableId="640155789">
-    <w:abstractNumId w:val="13"/>
+  <w:num w:numId="21" w16cid:durableId="843207057">
+    <w:abstractNumId w:val="9"/>
   </w:num>
 </w:numbering>
 </file>
@@ -5066,7 +5253,6 @@
   <w:style w:type="character" w:default="1" w:styleId="Absatz-Standardschriftart">
     <w:name w:val="Default Paragraph Font"/>
     <w:uiPriority w:val="1"/>
-    <w:semiHidden/>
     <w:unhideWhenUsed/>
   </w:style>
   <w:style w:type="table" w:default="1" w:styleId="NormaleTabelle">

</xml_diff>

<commit_message>
Doku weiter + Kommentar bei Spalten gelöscht
</commit_message>
<xml_diff>
--- a/Meier_Blättler_Maisenbacher_MMA25cL_Gruppe1.docx
+++ b/Meier_Blättler_Maisenbacher_MMA25cL_Gruppe1.docx
@@ -1361,7 +1361,13 @@
               <w:cnfStyle w:val="000000100000" w:firstRow="0" w:lastRow="0" w:firstColumn="0" w:lastColumn="0" w:oddVBand="0" w:evenVBand="0" w:oddHBand="1" w:evenHBand="0" w:firstRowFirstColumn="0" w:firstRowLastColumn="0" w:lastRowFirstColumn="0" w:lastRowLastColumn="0"/>
             </w:pPr>
             <w:r>
-              <w:t xml:space="preserve">- Google Font </w:t>
+              <w:t>-</w:t>
+            </w:r>
+            <w:r>
+              <w:t xml:space="preserve"> </w:t>
+            </w:r>
+            <w:r>
+              <w:t xml:space="preserve">Google Font </w:t>
             </w:r>
             <w:proofErr w:type="spellStart"/>
             <w:r>
@@ -1375,7 +1381,7 @@
           <w:p>
             <w:pPr>
               <w:tabs>
-                <w:tab w:val="left" w:pos="3206"/>
+                <w:tab w:val="left" w:pos="136"/>
               </w:tabs>
               <w:cnfStyle w:val="000000100000" w:firstRow="0" w:lastRow="0" w:firstColumn="0" w:lastColumn="0" w:oddVBand="0" w:evenVBand="0" w:oddHBand="1" w:evenHBand="0" w:firstRowFirstColumn="0" w:firstRowLastColumn="0" w:lastRowFirstColumn="0" w:lastRowLastColumn="0"/>
             </w:pPr>
@@ -1388,7 +1394,21 @@
             </w:r>
             <w:proofErr w:type="spellEnd"/>
             <w:r>
-              <w:t xml:space="preserve"> (Mobile und Desktop) </w:t>
+              <w:t xml:space="preserve"> (Mobile und </w:t>
+            </w:r>
+            <w:r>
+              <w:rPr>
+                <w:b/>
+                <w:bCs/>
+                <w:color w:val="FFFFFF" w:themeColor="background1"/>
+                <w:sz w:val="40"/>
+                <w:szCs w:val="40"/>
+                <w:lang w:val="fr-CH"/>
+              </w:rPr>
+              <w:tab/>
+            </w:r>
+            <w:r>
+              <w:t xml:space="preserve">Desktop) </w:t>
             </w:r>
           </w:p>
           <w:p>
@@ -1439,9 +1459,6 @@
           <w:p>
             <w:r>
               <w:t>Startseite</w:t>
-            </w:r>
-            <w:r>
-              <w:t xml:space="preserve"> (Text)</w:t>
             </w:r>
           </w:p>
           <w:p>
@@ -1555,9 +1572,46 @@
             <w:vAlign w:val="center"/>
           </w:tcPr>
           <w:p/>
-          <w:p/>
-          <w:p/>
-          <w:p/>
+          <w:p>
+            <w:pPr>
+              <w:rPr>
+                <w:b w:val="0"/>
+                <w:bCs w:val="0"/>
+              </w:rPr>
+            </w:pPr>
+            <w:r>
+              <w:t>Layout: 2-Spalten (Desktop + Smartphone)</w:t>
+            </w:r>
+          </w:p>
+          <w:p>
+            <w:pPr>
+              <w:rPr>
+                <w:b w:val="0"/>
+                <w:bCs w:val="0"/>
+              </w:rPr>
+            </w:pPr>
+            <w:r>
+              <w:rPr>
+                <w:b w:val="0"/>
+                <w:bCs w:val="0"/>
+              </w:rPr>
+              <w:t>Spalten</w:t>
+            </w:r>
+            <w:r>
+              <w:rPr>
+                <w:b w:val="0"/>
+                <w:bCs w:val="0"/>
+              </w:rPr>
+              <w:t>.html</w:t>
+            </w:r>
+            <w:r>
+              <w:rPr>
+                <w:b w:val="0"/>
+                <w:bCs w:val="0"/>
+              </w:rPr>
+              <w:t xml:space="preserve"> Zeile 45-73</w:t>
+            </w:r>
+          </w:p>
           <w:p/>
           <w:p/>
         </w:tc>
@@ -1569,8 +1623,16 @@
           </w:tcPr>
           <w:p>
             <w:pPr>
+              <w:pStyle w:val="Listenabsatz"/>
+              <w:numPr>
+                <w:ilvl w:val="0"/>
+                <w:numId w:val="21"/>
+              </w:numPr>
               <w:cnfStyle w:val="000000100000" w:firstRow="0" w:lastRow="0" w:firstColumn="0" w:lastColumn="0" w:oddVBand="0" w:evenVBand="0" w:oddHBand="1" w:evenHBand="0" w:firstRowFirstColumn="0" w:firstRowLastColumn="0" w:lastRowFirstColumn="0" w:lastRowLastColumn="0"/>
             </w:pPr>
+            <w:r>
+              <w:t>Ein Abschnitt, der auf dem Desktop und Smartphone mit zwei Spalten dargestellt wird</w:t>
+            </w:r>
           </w:p>
         </w:tc>
       </w:tr>

</xml_diff>